<commit_message>
Batch 1 fixes: logo centre, DoB dropdowns, units button picker, gender label, meal keyboard bug, meal tab reload, rest day card, schedule copy, More tab collapsed
</commit_message>
<xml_diff>
--- a/SwimFitPro_AppStore_Guide.docx
+++ b/SwimFitPro_AppStore_Guide.docx
@@ -1024,7 +1024,7 @@
           <w:sz w:val="22"/>
           <w:szCs w:val="22"/>
         </w:rPr>
-        <w:t xml:space="preserve">Register it (~£10–15/year)</w:t>
+        <w:t xml:space="preserve">Register it (~$14–20 CAD/year)</w:t>
       </w:r>
     </w:p>
     <w:p>
@@ -1078,7 +1078,7 @@
           <w:sz w:val="22"/>
           <w:szCs w:val="22"/>
         </w:rPr>
-        <w:t xml:space="preserve">Cost: £10–15/year. Non-negotiable. A custom domain signals legitimacy.</w:t>
+        <w:t xml:space="preserve">Cost: ~$14–20 CAD/year. Non-negotiable. A custom domain signals legitimacy.</w:t>
       </w:r>
     </w:p>
     <w:p>
@@ -1589,7 +1589,7 @@
           <w:sz w:val="22"/>
           <w:szCs w:val="22"/>
         </w:rPr>
-        <w:t xml:space="preserve">Tool: Carrd.co (£19/year) or Framer (free tier). A well-designed 1-pager beats a mediocre 5-page site.</w:t>
+        <w:t xml:space="preserve">Tool: Carrd.co ($25 USD/year) or Framer (free tier). A well-designed 1-pager beats a mediocre 5-page site.</w:t>
       </w:r>
     </w:p>
     <w:p>
@@ -2556,7 +2556,7 @@
           <w:sz w:val="22"/>
           <w:szCs w:val="22"/>
         </w:rPr>
-        <w:t xml:space="preserve">Estimated time with a developer: 2–4 hours. Cost if hiring: £150–400 one-time. Worth it.</w:t>
+        <w:t xml:space="preserve">Estimated time with a developer: 2–4 hours. Cost if hiring: $200–550 USD one-time. Worth it.</w:t>
       </w:r>
     </w:p>
     <w:p>
@@ -6050,7 +6050,7 @@
                 <w:sz w:val="20"/>
                 <w:szCs w:val="20"/>
               </w:rPr>
-              <w:t xml:space="preserve">~£10–15/yr — Namecheap or Cloudflare</w:t>
+              <w:t xml:space="preserve">~$14–20 CAD/yr — Namecheap or Cloudflare</w:t>
             </w:r>
           </w:p>
         </w:tc>

</xml_diff>